<commit_message>
los documentos el logo
</commit_message>
<xml_diff>
--- a/05. DOCUMENTACION/02. MANUAL TECNICO/MANUAL_TECNICO_CONV_UNI_RESTFUL_JAVA_SINBDD_GR01.docx
+++ b/05. DOCUMENTACION/02. MANUAL TECNICO/MANUAL_TECNICO_CONV_UNI_RESTFUL_JAVA_SINBDD_GR01.docx
@@ -68,12 +68,6 @@
         <w:gridCol w:w="5200"/>
       </w:tblGrid>
       <w:tr>
-        <w:tblPrEx>
-          <w:tblCellMar>
-            <w:top w:w="0" w:type="dxa"/>
-            <w:bottom w:w="0" w:type="dxa"/>
-          </w:tblCellMar>
-        </w:tblPrEx>
         <w:trPr>
           <w:trHeight w:hRule="exact" w:val="3000"/>
           <w:jc w:val="center"/>
@@ -95,28 +89,56 @@
             </w:pPr>
             <w:r>
               <w:rPr>
-                <w:b/>
-                <w:bCs/>
-                <w:color w:val="2E75B6"/>
-                <w:sz w:val="20"/>
-                <w:szCs w:val="20"/>
-              </w:rPr>
-              <w:t>[ IMAGEN DEL MONSTER ]</w:t>
-            </w:r>
-          </w:p>
-          <w:p>
-            <w:pPr>
-              <w:jc w:val="center"/>
-            </w:pPr>
-            <w:r>
-              <w:rPr>
-                <w:i/>
-                <w:iCs/>
-                <w:color w:val="7F7F7F"/>
-                <w:sz w:val="16"/>
-                <w:szCs w:val="16"/>
-              </w:rPr>
-              <w:t>Clic derecho en el recuadro → eliminar contenido e insertar la imagen</w:t>
+                <w:noProof/>
+              </w:rPr>
+              <w:drawing>
+                <wp:inline distT="0" distB="0" distL="0" distR="0" wp14:anchorId="4DC2B845" wp14:editId="1C705F82">
+                  <wp:extent cx="2863951" cy="1908243"/>
+                  <wp:effectExtent l="0" t="0" r="0" b="0"/>
+                  <wp:docPr id="780151789" name="Imagen 1"/>
+                  <wp:cNvGraphicFramePr>
+                    <a:graphicFrameLocks xmlns:a="http://schemas.openxmlformats.org/drawingml/2006/main" noChangeAspect="1"/>
+                  </wp:cNvGraphicFramePr>
+                  <a:graphic xmlns:a="http://schemas.openxmlformats.org/drawingml/2006/main">
+                    <a:graphicData uri="http://schemas.openxmlformats.org/drawingml/2006/picture">
+                      <pic:pic xmlns:pic="http://schemas.openxmlformats.org/drawingml/2006/picture">
+                        <pic:nvPicPr>
+                          <pic:cNvPr id="0" name="Picture 1"/>
+                          <pic:cNvPicPr>
+                            <a:picLocks noChangeAspect="1" noChangeArrowheads="1"/>
+                          </pic:cNvPicPr>
+                        </pic:nvPicPr>
+                        <pic:blipFill>
+                          <a:blip r:embed="rId7">
+                            <a:extLst>
+                              <a:ext uri="{28A0092B-C50C-407E-A947-70E740481C1C}">
+                                <a14:useLocalDpi xmlns:a14="http://schemas.microsoft.com/office/drawing/2010/main" val="0"/>
+                              </a:ext>
+                            </a:extLst>
+                          </a:blip>
+                          <a:srcRect/>
+                          <a:stretch>
+                            <a:fillRect/>
+                          </a:stretch>
+                        </pic:blipFill>
+                        <pic:spPr bwMode="auto">
+                          <a:xfrm>
+                            <a:off x="0" y="0"/>
+                            <a:ext cx="2874591" cy="1915332"/>
+                          </a:xfrm>
+                          <a:prstGeom prst="rect">
+                            <a:avLst/>
+                          </a:prstGeom>
+                          <a:noFill/>
+                          <a:ln>
+                            <a:noFill/>
+                          </a:ln>
+                        </pic:spPr>
+                      </pic:pic>
+                    </a:graphicData>
+                  </a:graphic>
+                </wp:inline>
+              </w:drawing>
             </w:r>
           </w:p>
         </w:tc>
@@ -240,12 +262,21 @@
         <w:spacing w:after="40" w:line="300" w:lineRule="auto"/>
         <w:jc w:val="center"/>
       </w:pPr>
+      <w:proofErr w:type="gramStart"/>
       <w:r>
         <w:rPr>
           <w:sz w:val="20"/>
           <w:szCs w:val="20"/>
         </w:rPr>
-        <w:t>MIS.MDU.CCNA.CCIA.</w:t>
+        <w:t>MIS.MDU.CCNA.CCIA</w:t>
+      </w:r>
+      <w:proofErr w:type="gramEnd"/>
+      <w:r>
+        <w:rPr>
+          <w:sz w:val="20"/>
+          <w:szCs w:val="20"/>
+        </w:rPr>
+        <w:t>.</w:t>
       </w:r>
     </w:p>
     <w:p>
@@ -2823,12 +2854,6 @@
         <w:gridCol w:w="7026"/>
       </w:tblGrid>
       <w:tr>
-        <w:tblPrEx>
-          <w:tblCellMar>
-            <w:top w:w="0" w:type="dxa"/>
-            <w:bottom w:w="0" w:type="dxa"/>
-          </w:tblCellMar>
-        </w:tblPrEx>
         <w:trPr>
           <w:tblHeader/>
         </w:trPr>
@@ -2902,12 +2927,6 @@
         </w:tc>
       </w:tr>
       <w:tr>
-        <w:tblPrEx>
-          <w:tblCellMar>
-            <w:top w:w="0" w:type="dxa"/>
-            <w:bottom w:w="0" w:type="dxa"/>
-          </w:tblCellMar>
-        </w:tblPrEx>
         <w:trPr>
           <w:cantSplit/>
         </w:trPr>
@@ -2971,12 +2990,6 @@
         </w:tc>
       </w:tr>
       <w:tr>
-        <w:tblPrEx>
-          <w:tblCellMar>
-            <w:top w:w="0" w:type="dxa"/>
-            <w:bottom w:w="0" w:type="dxa"/>
-          </w:tblCellMar>
-        </w:tblPrEx>
         <w:trPr>
           <w:cantSplit/>
         </w:trPr>
@@ -3040,12 +3053,6 @@
         </w:tc>
       </w:tr>
       <w:tr>
-        <w:tblPrEx>
-          <w:tblCellMar>
-            <w:top w:w="0" w:type="dxa"/>
-            <w:bottom w:w="0" w:type="dxa"/>
-          </w:tblCellMar>
-        </w:tblPrEx>
         <w:trPr>
           <w:cantSplit/>
         </w:trPr>
@@ -3141,12 +3148,6 @@
         </w:tc>
       </w:tr>
       <w:tr>
-        <w:tblPrEx>
-          <w:tblCellMar>
-            <w:top w:w="0" w:type="dxa"/>
-            <w:bottom w:w="0" w:type="dxa"/>
-          </w:tblCellMar>
-        </w:tblPrEx>
         <w:trPr>
           <w:cantSplit/>
         </w:trPr>
@@ -3210,12 +3211,6 @@
         </w:tc>
       </w:tr>
       <w:tr>
-        <w:tblPrEx>
-          <w:tblCellMar>
-            <w:top w:w="0" w:type="dxa"/>
-            <w:bottom w:w="0" w:type="dxa"/>
-          </w:tblCellMar>
-        </w:tblPrEx>
         <w:trPr>
           <w:cantSplit/>
         </w:trPr>
@@ -3296,12 +3291,6 @@
         </w:tc>
       </w:tr>
       <w:tr>
-        <w:tblPrEx>
-          <w:tblCellMar>
-            <w:top w:w="0" w:type="dxa"/>
-            <w:bottom w:w="0" w:type="dxa"/>
-          </w:tblCellMar>
-        </w:tblPrEx>
         <w:trPr>
           <w:cantSplit/>
         </w:trPr>
@@ -3560,7 +3549,7 @@
                     </pic:cNvPicPr>
                   </pic:nvPicPr>
                   <pic:blipFill>
-                    <a:blip r:embed="rId7"/>
+                    <a:blip r:embed="rId8"/>
                     <a:srcRect/>
                     <a:stretch>
                       <a:fillRect/>
@@ -3626,7 +3615,7 @@
                     </pic:cNvPicPr>
                   </pic:nvPicPr>
                   <pic:blipFill>
-                    <a:blip r:embed="rId8"/>
+                    <a:blip r:embed="rId9"/>
                     <a:srcRect/>
                     <a:stretch>
                       <a:fillRect/>
@@ -3718,12 +3707,6 @@
         <w:gridCol w:w="2000"/>
       </w:tblGrid>
       <w:tr>
-        <w:tblPrEx>
-          <w:tblCellMar>
-            <w:top w:w="0" w:type="dxa"/>
-            <w:bottom w:w="0" w:type="dxa"/>
-          </w:tblCellMar>
-        </w:tblPrEx>
         <w:trPr>
           <w:tblHeader/>
         </w:trPr>
@@ -3831,12 +3814,6 @@
         </w:tc>
       </w:tr>
       <w:tr>
-        <w:tblPrEx>
-          <w:tblCellMar>
-            <w:top w:w="0" w:type="dxa"/>
-            <w:bottom w:w="0" w:type="dxa"/>
-          </w:tblCellMar>
-        </w:tblPrEx>
         <w:trPr>
           <w:cantSplit/>
         </w:trPr>
@@ -3945,12 +3922,6 @@
         </w:tc>
       </w:tr>
       <w:tr>
-        <w:tblPrEx>
-          <w:tblCellMar>
-            <w:top w:w="0" w:type="dxa"/>
-            <w:bottom w:w="0" w:type="dxa"/>
-          </w:tblCellMar>
-        </w:tblPrEx>
         <w:trPr>
           <w:cantSplit/>
         </w:trPr>
@@ -4052,12 +4023,6 @@
         </w:tc>
       </w:tr>
       <w:tr>
-        <w:tblPrEx>
-          <w:tblCellMar>
-            <w:top w:w="0" w:type="dxa"/>
-            <w:bottom w:w="0" w:type="dxa"/>
-          </w:tblCellMar>
-        </w:tblPrEx>
         <w:trPr>
           <w:cantSplit/>
         </w:trPr>
@@ -4159,12 +4124,6 @@
         </w:tc>
       </w:tr>
       <w:tr>
-        <w:tblPrEx>
-          <w:tblCellMar>
-            <w:top w:w="0" w:type="dxa"/>
-            <w:bottom w:w="0" w:type="dxa"/>
-          </w:tblCellMar>
-        </w:tblPrEx>
         <w:trPr>
           <w:cantSplit/>
         </w:trPr>
@@ -4257,12 +4216,6 @@
         </w:tc>
       </w:tr>
       <w:tr>
-        <w:tblPrEx>
-          <w:tblCellMar>
-            <w:top w:w="0" w:type="dxa"/>
-            <w:bottom w:w="0" w:type="dxa"/>
-          </w:tblCellMar>
-        </w:tblPrEx>
         <w:trPr>
           <w:cantSplit/>
         </w:trPr>
@@ -4355,12 +4308,6 @@
         </w:tc>
       </w:tr>
       <w:tr>
-        <w:tblPrEx>
-          <w:tblCellMar>
-            <w:top w:w="0" w:type="dxa"/>
-            <w:bottom w:w="0" w:type="dxa"/>
-          </w:tblCellMar>
-        </w:tblPrEx>
         <w:trPr>
           <w:cantSplit/>
         </w:trPr>
@@ -4478,12 +4425,6 @@
         </w:tc>
       </w:tr>
       <w:tr>
-        <w:tblPrEx>
-          <w:tblCellMar>
-            <w:top w:w="0" w:type="dxa"/>
-            <w:bottom w:w="0" w:type="dxa"/>
-          </w:tblCellMar>
-        </w:tblPrEx>
         <w:trPr>
           <w:cantSplit/>
         </w:trPr>
@@ -4608,12 +4549,6 @@
         </w:tc>
       </w:tr>
       <w:tr>
-        <w:tblPrEx>
-          <w:tblCellMar>
-            <w:top w:w="0" w:type="dxa"/>
-            <w:bottom w:w="0" w:type="dxa"/>
-          </w:tblCellMar>
-        </w:tblPrEx>
         <w:trPr>
           <w:cantSplit/>
         </w:trPr>
@@ -4715,12 +4650,6 @@
         </w:tc>
       </w:tr>
       <w:tr>
-        <w:tblPrEx>
-          <w:tblCellMar>
-            <w:top w:w="0" w:type="dxa"/>
-            <w:bottom w:w="0" w:type="dxa"/>
-          </w:tblCellMar>
-        </w:tblPrEx>
         <w:trPr>
           <w:cantSplit/>
         </w:trPr>
@@ -4838,12 +4767,6 @@
         </w:tc>
       </w:tr>
       <w:tr>
-        <w:tblPrEx>
-          <w:tblCellMar>
-            <w:top w:w="0" w:type="dxa"/>
-            <w:bottom w:w="0" w:type="dxa"/>
-          </w:tblCellMar>
-        </w:tblPrEx>
         <w:trPr>
           <w:cantSplit/>
         </w:trPr>
@@ -4908,6 +4831,7 @@
               <w:t>Windows 11 (</w:t>
             </w:r>
             <w:proofErr w:type="spellStart"/>
+            <w:proofErr w:type="gramStart"/>
             <w:r>
               <w:rPr>
                 <w:sz w:val="20"/>
@@ -4923,7 +4847,16 @@
                 <w:szCs w:val="20"/>
                 <w:lang w:val="en-US"/>
               </w:rPr>
-              <w:t>) · Android 14+ (Samsung Galaxy S22 Ultra)</w:t>
+              <w:t>) ·</w:t>
+            </w:r>
+            <w:proofErr w:type="gramEnd"/>
+            <w:r>
+              <w:rPr>
+                <w:sz w:val="20"/>
+                <w:szCs w:val="20"/>
+                <w:lang w:val="en-US"/>
+              </w:rPr>
+              <w:t xml:space="preserve"> Android 14+ (Samsung Galaxy S22 Ultra)</w:t>
             </w:r>
           </w:p>
         </w:tc>
@@ -5071,7 +5004,27 @@
           <w:sz w:val="17"/>
           <w:szCs w:val="17"/>
         </w:rPr>
-        <w:t>├── 04. CLICON/         CLICON_CONV_UNI_RESTFUL_JAVA   (cliente consola)</w:t>
+        <w:t>├── 04. CLICON/         CLICON_CONV_UNI_RESTFUL_JAVA</w:t>
+      </w:r>
+      <w:proofErr w:type="gramStart"/>
+      <w:r>
+        <w:rPr>
+          <w:rFonts w:ascii="Consolas" w:eastAsia="Consolas" w:hAnsi="Consolas" w:cs="Consolas"/>
+          <w:color w:val="1F3864"/>
+          <w:sz w:val="17"/>
+          <w:szCs w:val="17"/>
+        </w:rPr>
+        <w:t xml:space="preserve">   (</w:t>
+      </w:r>
+      <w:proofErr w:type="gramEnd"/>
+      <w:r>
+        <w:rPr>
+          <w:rFonts w:ascii="Consolas" w:eastAsia="Consolas" w:hAnsi="Consolas" w:cs="Consolas"/>
+          <w:color w:val="1F3864"/>
+          <w:sz w:val="17"/>
+          <w:szCs w:val="17"/>
+        </w:rPr>
+        <w:t>cliente consola)</w:t>
       </w:r>
     </w:p>
     <w:p>
@@ -5090,7 +5043,27 @@
           <w:sz w:val="17"/>
           <w:szCs w:val="17"/>
         </w:rPr>
-        <w:t>├── 04. CLIESC/         CLIESC_CONV_UNI_RESTFUL_JAVA   (cliente escritorio)</w:t>
+        <w:t>├── 04. CLIESC/         CLIESC_CONV_UNI_RESTFUL_JAVA</w:t>
+      </w:r>
+      <w:proofErr w:type="gramStart"/>
+      <w:r>
+        <w:rPr>
+          <w:rFonts w:ascii="Consolas" w:eastAsia="Consolas" w:hAnsi="Consolas" w:cs="Consolas"/>
+          <w:color w:val="1F3864"/>
+          <w:sz w:val="17"/>
+          <w:szCs w:val="17"/>
+        </w:rPr>
+        <w:t xml:space="preserve">   (</w:t>
+      </w:r>
+      <w:proofErr w:type="gramEnd"/>
+      <w:r>
+        <w:rPr>
+          <w:rFonts w:ascii="Consolas" w:eastAsia="Consolas" w:hAnsi="Consolas" w:cs="Consolas"/>
+          <w:color w:val="1F3864"/>
+          <w:sz w:val="17"/>
+          <w:szCs w:val="17"/>
+        </w:rPr>
+        <w:t>cliente escritorio)</w:t>
       </w:r>
     </w:p>
     <w:p>
@@ -5128,7 +5101,27 @@
           <w:sz w:val="17"/>
           <w:szCs w:val="17"/>
         </w:rPr>
-        <w:t>├── 04. CLIWEB/         CLIWEB_CONV_UNI_RESTFUL_JAVA   (cliente web)</w:t>
+        <w:t>├── 04. CLIWEB/         CLIWEB_CONV_UNI_RESTFUL_JAVA</w:t>
+      </w:r>
+      <w:proofErr w:type="gramStart"/>
+      <w:r>
+        <w:rPr>
+          <w:rFonts w:ascii="Consolas" w:eastAsia="Consolas" w:hAnsi="Consolas" w:cs="Consolas"/>
+          <w:color w:val="1F3864"/>
+          <w:sz w:val="17"/>
+          <w:szCs w:val="17"/>
+        </w:rPr>
+        <w:t xml:space="preserve">   (</w:t>
+      </w:r>
+      <w:proofErr w:type="gramEnd"/>
+      <w:r>
+        <w:rPr>
+          <w:rFonts w:ascii="Consolas" w:eastAsia="Consolas" w:hAnsi="Consolas" w:cs="Consolas"/>
+          <w:color w:val="1F3864"/>
+          <w:sz w:val="17"/>
+          <w:szCs w:val="17"/>
+        </w:rPr>
+        <w:t>cliente web)</w:t>
       </w:r>
     </w:p>
     <w:p>
@@ -5147,7 +5140,27 @@
           <w:sz w:val="17"/>
           <w:szCs w:val="17"/>
         </w:rPr>
-        <w:t>├── 04. SERVIDOR/       WS_CONV_UNI_RESTFUL_JAVA       (servicio REST)</w:t>
+        <w:t xml:space="preserve">├── 04. SERVIDOR/       WS_CONV_UNI_RESTFUL_JAVA    </w:t>
+      </w:r>
+      <w:proofErr w:type="gramStart"/>
+      <w:r>
+        <w:rPr>
+          <w:rFonts w:ascii="Consolas" w:eastAsia="Consolas" w:hAnsi="Consolas" w:cs="Consolas"/>
+          <w:color w:val="1F3864"/>
+          <w:sz w:val="17"/>
+          <w:szCs w:val="17"/>
+        </w:rPr>
+        <w:t xml:space="preserve">   (</w:t>
+      </w:r>
+      <w:proofErr w:type="gramEnd"/>
+      <w:r>
+        <w:rPr>
+          <w:rFonts w:ascii="Consolas" w:eastAsia="Consolas" w:hAnsi="Consolas" w:cs="Consolas"/>
+          <w:color w:val="1F3864"/>
+          <w:sz w:val="17"/>
+          <w:szCs w:val="17"/>
+        </w:rPr>
+        <w:t>servicio REST)</w:t>
       </w:r>
     </w:p>
     <w:p>
@@ -5166,7 +5179,27 @@
           <w:sz w:val="17"/>
           <w:szCs w:val="17"/>
         </w:rPr>
-        <w:t>├── 05. DOCUMENTACION/  Manual técnico y presentación</w:t>
+        <w:t>├── 05. DOCUMENTACION</w:t>
+      </w:r>
+      <w:proofErr w:type="gramStart"/>
+      <w:r>
+        <w:rPr>
+          <w:rFonts w:ascii="Consolas" w:eastAsia="Consolas" w:hAnsi="Consolas" w:cs="Consolas"/>
+          <w:color w:val="1F3864"/>
+          <w:sz w:val="17"/>
+          <w:szCs w:val="17"/>
+        </w:rPr>
+        <w:t>/  Manual</w:t>
+      </w:r>
+      <w:proofErr w:type="gramEnd"/>
+      <w:r>
+        <w:rPr>
+          <w:rFonts w:ascii="Consolas" w:eastAsia="Consolas" w:hAnsi="Consolas" w:cs="Consolas"/>
+          <w:color w:val="1F3864"/>
+          <w:sz w:val="17"/>
+          <w:szCs w:val="17"/>
+        </w:rPr>
+        <w:t xml:space="preserve"> técnico y presentación</w:t>
       </w:r>
     </w:p>
     <w:p>
@@ -5197,10 +5230,12 @@
         <w:t xml:space="preserve">Todos los proyectos usan el paquete base </w:t>
       </w:r>
       <w:proofErr w:type="spellStart"/>
+      <w:proofErr w:type="gramStart"/>
       <w:r>
         <w:t>ec.edu.monster</w:t>
       </w:r>
       <w:proofErr w:type="spellEnd"/>
+      <w:proofErr w:type="gramEnd"/>
       <w:r>
         <w:t xml:space="preserve"> y se organizan en las capas modelo, vista y controlador.</w:t>
       </w:r>
@@ -5278,12 +5313,6 @@
         <w:gridCol w:w="5426"/>
       </w:tblGrid>
       <w:tr>
-        <w:tblPrEx>
-          <w:tblCellMar>
-            <w:top w:w="0" w:type="dxa"/>
-            <w:bottom w:w="0" w:type="dxa"/>
-          </w:tblCellMar>
-        </w:tblPrEx>
         <w:trPr>
           <w:tblHeader/>
         </w:trPr>
@@ -5391,12 +5420,6 @@
         </w:tc>
       </w:tr>
       <w:tr>
-        <w:tblPrEx>
-          <w:tblCellMar>
-            <w:top w:w="0" w:type="dxa"/>
-            <w:bottom w:w="0" w:type="dxa"/>
-          </w:tblCellMar>
-        </w:tblPrEx>
         <w:trPr>
           <w:cantSplit/>
         </w:trPr>
@@ -5489,12 +5512,6 @@
         </w:tc>
       </w:tr>
       <w:tr>
-        <w:tblPrEx>
-          <w:tblCellMar>
-            <w:top w:w="0" w:type="dxa"/>
-            <w:bottom w:w="0" w:type="dxa"/>
-          </w:tblCellMar>
-        </w:tblPrEx>
         <w:trPr>
           <w:cantSplit/>
         </w:trPr>
@@ -5587,12 +5604,6 @@
         </w:tc>
       </w:tr>
       <w:tr>
-        <w:tblPrEx>
-          <w:tblCellMar>
-            <w:top w:w="0" w:type="dxa"/>
-            <w:bottom w:w="0" w:type="dxa"/>
-          </w:tblCellMar>
-        </w:tblPrEx>
         <w:trPr>
           <w:cantSplit/>
         </w:trPr>
@@ -5686,12 +5697,6 @@
         </w:tc>
       </w:tr>
       <w:tr>
-        <w:tblPrEx>
-          <w:tblCellMar>
-            <w:top w:w="0" w:type="dxa"/>
-            <w:bottom w:w="0" w:type="dxa"/>
-          </w:tblCellMar>
-        </w:tblPrEx>
         <w:trPr>
           <w:cantSplit/>
         </w:trPr>
@@ -5996,12 +6001,6 @@
         <w:gridCol w:w="4326"/>
       </w:tblGrid>
       <w:tr>
-        <w:tblPrEx>
-          <w:tblCellMar>
-            <w:top w:w="0" w:type="dxa"/>
-            <w:bottom w:w="0" w:type="dxa"/>
-          </w:tblCellMar>
-        </w:tblPrEx>
         <w:trPr>
           <w:tblHeader/>
         </w:trPr>
@@ -6143,12 +6142,6 @@
         </w:tc>
       </w:tr>
       <w:tr>
-        <w:tblPrEx>
-          <w:tblCellMar>
-            <w:top w:w="0" w:type="dxa"/>
-            <w:bottom w:w="0" w:type="dxa"/>
-          </w:tblCellMar>
-        </w:tblPrEx>
         <w:trPr>
           <w:cantSplit/>
         </w:trPr>
@@ -6279,12 +6272,6 @@
         </w:tc>
       </w:tr>
       <w:tr>
-        <w:tblPrEx>
-          <w:tblCellMar>
-            <w:top w:w="0" w:type="dxa"/>
-            <w:bottom w:w="0" w:type="dxa"/>
-          </w:tblCellMar>
-        </w:tblPrEx>
         <w:trPr>
           <w:cantSplit/>
         </w:trPr>
@@ -6422,12 +6409,6 @@
         </w:tc>
       </w:tr>
       <w:tr>
-        <w:tblPrEx>
-          <w:tblCellMar>
-            <w:top w:w="0" w:type="dxa"/>
-            <w:bottom w:w="0" w:type="dxa"/>
-          </w:tblCellMar>
-        </w:tblPrEx>
         <w:trPr>
           <w:cantSplit/>
         </w:trPr>
@@ -6574,12 +6555,6 @@
         </w:tc>
       </w:tr>
       <w:tr>
-        <w:tblPrEx>
-          <w:tblCellMar>
-            <w:top w:w="0" w:type="dxa"/>
-            <w:bottom w:w="0" w:type="dxa"/>
-          </w:tblCellMar>
-        </w:tblPrEx>
         <w:trPr>
           <w:cantSplit/>
         </w:trPr>
@@ -6701,12 +6676,6 @@
         </w:tc>
       </w:tr>
       <w:tr>
-        <w:tblPrEx>
-          <w:tblCellMar>
-            <w:top w:w="0" w:type="dxa"/>
-            <w:bottom w:w="0" w:type="dxa"/>
-          </w:tblCellMar>
-        </w:tblPrEx>
         <w:trPr>
           <w:cantSplit/>
         </w:trPr>
@@ -6828,12 +6797,6 @@
         </w:tc>
       </w:tr>
       <w:tr>
-        <w:tblPrEx>
-          <w:tblCellMar>
-            <w:top w:w="0" w:type="dxa"/>
-            <w:bottom w:w="0" w:type="dxa"/>
-          </w:tblCellMar>
-        </w:tblPrEx>
         <w:trPr>
           <w:cantSplit/>
         </w:trPr>
@@ -6955,12 +6918,6 @@
         </w:tc>
       </w:tr>
       <w:tr>
-        <w:tblPrEx>
-          <w:tblCellMar>
-            <w:top w:w="0" w:type="dxa"/>
-            <w:bottom w:w="0" w:type="dxa"/>
-          </w:tblCellMar>
-        </w:tblPrEx>
         <w:trPr>
           <w:cantSplit/>
         </w:trPr>
@@ -7289,6 +7246,7 @@
         <w:t>exito</w:t>
       </w:r>
       <w:proofErr w:type="spellEnd"/>
+      <w:proofErr w:type="gramStart"/>
       <w:r>
         <w:rPr>
           <w:rFonts w:ascii="Consolas" w:eastAsia="Consolas" w:hAnsi="Consolas" w:cs="Consolas"/>
@@ -7306,7 +7264,17 @@
           <w:sz w:val="17"/>
           <w:szCs w:val="17"/>
         </w:rPr>
-        <w:t>true,"mensaje":"Bienvenido</w:t>
+        <w:t>true</w:t>
+      </w:r>
+      <w:proofErr w:type="gramEnd"/>
+      <w:r>
+        <w:rPr>
+          <w:rFonts w:ascii="Consolas" w:eastAsia="Consolas" w:hAnsi="Consolas" w:cs="Consolas"/>
+          <w:color w:val="1F3864"/>
+          <w:sz w:val="17"/>
+          <w:szCs w:val="17"/>
+        </w:rPr>
+        <w:t>,"mensaje":"Bienvenido</w:t>
       </w:r>
       <w:proofErr w:type="spellEnd"/>
       <w:r>
@@ -7355,7 +7323,27 @@
           <w:sz w:val="17"/>
           <w:szCs w:val="17"/>
         </w:rPr>
-        <w:t xml:space="preserve">        "datos":{"token":"9f2c…","usuario":"monster","expira":"2026-10-28T10:30:00","minutosVigencia":30}}</w:t>
+        <w:t xml:space="preserve">        "datos</w:t>
+      </w:r>
+      <w:proofErr w:type="gramStart"/>
+      <w:r>
+        <w:rPr>
+          <w:rFonts w:ascii="Consolas" w:eastAsia="Consolas" w:hAnsi="Consolas" w:cs="Consolas"/>
+          <w:color w:val="1F3864"/>
+          <w:sz w:val="17"/>
+          <w:szCs w:val="17"/>
+        </w:rPr>
+        <w:t>":{</w:t>
+      </w:r>
+      <w:proofErr w:type="gramEnd"/>
+      <w:r>
+        <w:rPr>
+          <w:rFonts w:ascii="Consolas" w:eastAsia="Consolas" w:hAnsi="Consolas" w:cs="Consolas"/>
+          <w:color w:val="1F3864"/>
+          <w:sz w:val="17"/>
+          <w:szCs w:val="17"/>
+        </w:rPr>
+        <w:t>"token":"9f2c…","usuario":"monster","expira":"2026-10-28T10:30:00","minutosVigencia":30}}</w:t>
       </w:r>
     </w:p>
     <w:p>
@@ -7525,6 +7513,7 @@
         <w:t>exito</w:t>
       </w:r>
       <w:proofErr w:type="spellEnd"/>
+      <w:proofErr w:type="gramStart"/>
       <w:r>
         <w:rPr>
           <w:rFonts w:ascii="Consolas" w:eastAsia="Consolas" w:hAnsi="Consolas" w:cs="Consolas"/>
@@ -7542,7 +7531,17 @@
           <w:sz w:val="17"/>
           <w:szCs w:val="17"/>
         </w:rPr>
-        <w:t>true,"mensaje":"Conversión</w:t>
+        <w:t>true</w:t>
+      </w:r>
+      <w:proofErr w:type="gramEnd"/>
+      <w:r>
+        <w:rPr>
+          <w:rFonts w:ascii="Consolas" w:eastAsia="Consolas" w:hAnsi="Consolas" w:cs="Consolas"/>
+          <w:color w:val="1F3864"/>
+          <w:sz w:val="17"/>
+          <w:szCs w:val="17"/>
+        </w:rPr>
+        <w:t>,"mensaje":"Conversión</w:t>
       </w:r>
       <w:proofErr w:type="spellEnd"/>
       <w:r>
@@ -7571,7 +7570,27 @@
           <w:sz w:val="17"/>
           <w:szCs w:val="17"/>
         </w:rPr>
-        <w:t xml:space="preserve">        "datos":{"magnitud":"MASA","valor":2.0,"resultado":90.7185,"simboloDestino":"kg",</w:t>
+        <w:t xml:space="preserve">        "datos</w:t>
+      </w:r>
+      <w:proofErr w:type="gramStart"/>
+      <w:r>
+        <w:rPr>
+          <w:rFonts w:ascii="Consolas" w:eastAsia="Consolas" w:hAnsi="Consolas" w:cs="Consolas"/>
+          <w:color w:val="1F3864"/>
+          <w:sz w:val="17"/>
+          <w:szCs w:val="17"/>
+        </w:rPr>
+        <w:t>":{</w:t>
+      </w:r>
+      <w:proofErr w:type="gramEnd"/>
+      <w:r>
+        <w:rPr>
+          <w:rFonts w:ascii="Consolas" w:eastAsia="Consolas" w:hAnsi="Consolas" w:cs="Consolas"/>
+          <w:color w:val="1F3864"/>
+          <w:sz w:val="17"/>
+          <w:szCs w:val="17"/>
+        </w:rPr>
+        <w:t>"magnitud":"MASA","valor":2.0,"resultado":90.7185,"simboloDestino":"kg",</w:t>
       </w:r>
     </w:p>
     <w:p>
@@ -7665,12 +7684,6 @@
         <w:gridCol w:w="3000"/>
       </w:tblGrid>
       <w:tr>
-        <w:tblPrEx>
-          <w:tblCellMar>
-            <w:top w:w="0" w:type="dxa"/>
-            <w:bottom w:w="0" w:type="dxa"/>
-          </w:tblCellMar>
-        </w:tblPrEx>
         <w:trPr>
           <w:tblHeader/>
         </w:trPr>
@@ -7778,12 +7791,6 @@
         </w:tc>
       </w:tr>
       <w:tr>
-        <w:tblPrEx>
-          <w:tblCellMar>
-            <w:top w:w="0" w:type="dxa"/>
-            <w:bottom w:w="0" w:type="dxa"/>
-          </w:tblCellMar>
-        </w:tblPrEx>
         <w:trPr>
           <w:cantSplit/>
         </w:trPr>
@@ -7876,12 +7883,6 @@
         </w:tc>
       </w:tr>
       <w:tr>
-        <w:tblPrEx>
-          <w:tblCellMar>
-            <w:top w:w="0" w:type="dxa"/>
-            <w:bottom w:w="0" w:type="dxa"/>
-          </w:tblCellMar>
-        </w:tblPrEx>
         <w:trPr>
           <w:cantSplit/>
         </w:trPr>
@@ -7974,12 +7975,6 @@
         </w:tc>
       </w:tr>
       <w:tr>
-        <w:tblPrEx>
-          <w:tblCellMar>
-            <w:top w:w="0" w:type="dxa"/>
-            <w:bottom w:w="0" w:type="dxa"/>
-          </w:tblCellMar>
-        </w:tblPrEx>
         <w:trPr>
           <w:cantSplit/>
         </w:trPr>
@@ -8072,12 +8067,6 @@
         </w:tc>
       </w:tr>
       <w:tr>
-        <w:tblPrEx>
-          <w:tblCellMar>
-            <w:top w:w="0" w:type="dxa"/>
-            <w:bottom w:w="0" w:type="dxa"/>
-          </w:tblCellMar>
-        </w:tblPrEx>
         <w:trPr>
           <w:cantSplit/>
         </w:trPr>
@@ -8236,7 +8225,7 @@
                     </pic:cNvPicPr>
                   </pic:nvPicPr>
                   <pic:blipFill>
-                    <a:blip r:embed="rId9"/>
+                    <a:blip r:embed="rId10"/>
                     <a:srcRect/>
                     <a:stretch>
                       <a:fillRect/>
@@ -8296,10 +8285,20 @@
         <w:t xml:space="preserve">La clase </w:t>
       </w:r>
       <w:proofErr w:type="spellStart"/>
-      <w:r>
-        <w:t>ec.edu.monster.prueba.PruebasConversion</w:t>
+      <w:proofErr w:type="gramStart"/>
+      <w:r>
+        <w:t>ec.edu.monster</w:t>
+      </w:r>
+      <w:proofErr w:type="gramEnd"/>
+      <w:r>
+        <w:t>.</w:t>
+      </w:r>
+      <w:proofErr w:type="gramStart"/>
+      <w:r>
+        <w:t>prueba.PruebasConversion</w:t>
       </w:r>
       <w:proofErr w:type="spellEnd"/>
+      <w:proofErr w:type="gramEnd"/>
       <w:r>
         <w:t xml:space="preserve"> (</w:t>
       </w:r>
@@ -8339,7 +8338,7 @@
                     </pic:cNvPicPr>
                   </pic:nvPicPr>
                   <pic:blipFill>
-                    <a:blip r:embed="rId10"/>
+                    <a:blip r:embed="rId11"/>
                     <a:srcRect/>
                     <a:stretch>
                       <a:fillRect/>
@@ -8449,12 +8448,6 @@
         <w:gridCol w:w="5280"/>
       </w:tblGrid>
       <w:tr>
-        <w:tblPrEx>
-          <w:tblCellMar>
-            <w:top w:w="0" w:type="dxa"/>
-            <w:bottom w:w="0" w:type="dxa"/>
-          </w:tblCellMar>
-        </w:tblPrEx>
         <w:trPr>
           <w:tblHeader/>
         </w:trPr>
@@ -8596,12 +8589,6 @@
         </w:tc>
       </w:tr>
       <w:tr>
-        <w:tblPrEx>
-          <w:tblCellMar>
-            <w:top w:w="0" w:type="dxa"/>
-            <w:bottom w:w="0" w:type="dxa"/>
-          </w:tblCellMar>
-        </w:tblPrEx>
         <w:trPr>
           <w:cantSplit/>
         </w:trPr>
@@ -8739,12 +8726,6 @@
         </w:tc>
       </w:tr>
       <w:tr>
-        <w:tblPrEx>
-          <w:tblCellMar>
-            <w:top w:w="0" w:type="dxa"/>
-            <w:bottom w:w="0" w:type="dxa"/>
-          </w:tblCellMar>
-        </w:tblPrEx>
         <w:trPr>
           <w:cantSplit/>
         </w:trPr>
@@ -8895,12 +8876,6 @@
         </w:tc>
       </w:tr>
       <w:tr>
-        <w:tblPrEx>
-          <w:tblCellMar>
-            <w:top w:w="0" w:type="dxa"/>
-            <w:bottom w:w="0" w:type="dxa"/>
-          </w:tblCellMar>
-        </w:tblPrEx>
         <w:trPr>
           <w:cantSplit/>
         </w:trPr>
@@ -9035,12 +9010,6 @@
         </w:tc>
       </w:tr>
       <w:tr>
-        <w:tblPrEx>
-          <w:tblCellMar>
-            <w:top w:w="0" w:type="dxa"/>
-            <w:bottom w:w="0" w:type="dxa"/>
-          </w:tblCellMar>
-        </w:tblPrEx>
         <w:trPr>
           <w:cantSplit/>
         </w:trPr>
@@ -9152,6 +9121,7 @@
               <w:t xml:space="preserve">, </w:t>
             </w:r>
             <w:proofErr w:type="spellStart"/>
+            <w:proofErr w:type="gramStart"/>
             <w:r>
               <w:rPr>
                 <w:sz w:val="20"/>
@@ -9161,6 +9131,7 @@
               <w:t>org.json</w:t>
             </w:r>
             <w:proofErr w:type="spellEnd"/>
+            <w:proofErr w:type="gramEnd"/>
           </w:p>
         </w:tc>
         <w:tc>
@@ -9229,97 +9200,6 @@
             <wp:extent cx="5715000" cy="2752725"/>
             <wp:effectExtent l="0" t="0" r="0" b="0"/>
             <wp:docPr id="5" name="Imagen 5"/>
-            <wp:cNvGraphicFramePr>
-              <a:graphicFrameLocks xmlns:a="http://schemas.openxmlformats.org/drawingml/2006/main" noChangeAspect="1"/>
-            </wp:cNvGraphicFramePr>
-            <a:graphic xmlns:a="http://schemas.openxmlformats.org/drawingml/2006/main">
-              <a:graphicData uri="http://schemas.openxmlformats.org/drawingml/2006/picture">
-                <pic:pic xmlns:pic="http://schemas.openxmlformats.org/drawingml/2006/picture">
-                  <pic:nvPicPr>
-                    <pic:cNvPr id="0" name=""/>
-                    <pic:cNvPicPr>
-                      <a:picLocks noChangeAspect="1" noChangeArrowheads="1"/>
-                    </pic:cNvPicPr>
-                  </pic:nvPicPr>
-                  <pic:blipFill>
-                    <a:blip r:embed="rId11"/>
-                    <a:srcRect/>
-                    <a:stretch>
-                      <a:fillRect/>
-                    </a:stretch>
-                  </pic:blipFill>
-                  <pic:spPr bwMode="auto">
-                    <a:xfrm>
-                      <a:off x="0" y="0"/>
-                      <a:ext cx="5715000" cy="2752725"/>
-                    </a:xfrm>
-                    <a:prstGeom prst="rect">
-                      <a:avLst/>
-                    </a:prstGeom>
-                  </pic:spPr>
-                </pic:pic>
-              </a:graphicData>
-            </a:graphic>
-          </wp:inline>
-        </w:drawing>
-      </w:r>
-    </w:p>
-    <w:p>
-      <w:pPr>
-        <w:spacing w:before="120" w:after="80"/>
-        <w:jc w:val="center"/>
-      </w:pPr>
-      <w:r>
-        <w:rPr>
-          <w:b/>
-          <w:bCs/>
-          <w:i/>
-          <w:iCs/>
-          <w:sz w:val="20"/>
-          <w:szCs w:val="20"/>
-        </w:rPr>
-        <w:t>Ilustración 5. Cliente de consola y panel del servidor</w:t>
-      </w:r>
-    </w:p>
-    <w:p>
-      <w:pPr>
-        <w:pStyle w:val="Ttulo2"/>
-        <w:keepNext/>
-        <w:spacing w:before="200" w:after="100"/>
-      </w:pPr>
-      <w:bookmarkStart w:id="19" w:name="_Toc243856215"/>
-      <w:r>
-        <w:t>8.2. Cliente de escritorio</w:t>
-      </w:r>
-      <w:bookmarkEnd w:id="19"/>
-    </w:p>
-    <w:p>
-      <w:pPr>
-        <w:spacing w:after="120" w:line="300" w:lineRule="auto"/>
-        <w:jc w:val="both"/>
-      </w:pPr>
-      <w:r>
-        <w:t xml:space="preserve">Aplicación Swing con tema oscuro. La ventana de inicio de sesión muestra la imagen del Monster con una animación de flotación y sacude el formulario ante un error. La ventana principal ofrece botones de color por magnitud, listas de unidades, intercambio de unidades, un resultado que se anima contando hasta su valor, el historial de la sesión en una tabla y </w:t>
-      </w:r>
-      <w:r>
-        <w:lastRenderedPageBreak/>
-        <w:t>una barra de estado. Las llamadas al servidor se ejecutan en segundo plano para no bloquear la interfaz.</w:t>
-      </w:r>
-    </w:p>
-    <w:p>
-      <w:pPr>
-        <w:keepNext/>
-        <w:jc w:val="center"/>
-      </w:pPr>
-      <w:r>
-        <w:rPr>
-          <w:noProof/>
-        </w:rPr>
-        <w:drawing>
-          <wp:inline distT="0" distB="0" distL="0" distR="0" wp14:anchorId="0F5C8A7E" wp14:editId="6C39B0BA">
-            <wp:extent cx="5715000" cy="3390900"/>
-            <wp:effectExtent l="0" t="0" r="0" b="0"/>
-            <wp:docPr id="6" name="Imagen 6"/>
             <wp:cNvGraphicFramePr>
               <a:graphicFrameLocks xmlns:a="http://schemas.openxmlformats.org/drawingml/2006/main" noChangeAspect="1"/>
             </wp:cNvGraphicFramePr>
@@ -9342,6 +9222,97 @@
                   <pic:spPr bwMode="auto">
                     <a:xfrm>
                       <a:off x="0" y="0"/>
+                      <a:ext cx="5715000" cy="2752725"/>
+                    </a:xfrm>
+                    <a:prstGeom prst="rect">
+                      <a:avLst/>
+                    </a:prstGeom>
+                  </pic:spPr>
+                </pic:pic>
+              </a:graphicData>
+            </a:graphic>
+          </wp:inline>
+        </w:drawing>
+      </w:r>
+    </w:p>
+    <w:p>
+      <w:pPr>
+        <w:spacing w:before="120" w:after="80"/>
+        <w:jc w:val="center"/>
+      </w:pPr>
+      <w:r>
+        <w:rPr>
+          <w:b/>
+          <w:bCs/>
+          <w:i/>
+          <w:iCs/>
+          <w:sz w:val="20"/>
+          <w:szCs w:val="20"/>
+        </w:rPr>
+        <w:t>Ilustración 5. Cliente de consola y panel del servidor</w:t>
+      </w:r>
+    </w:p>
+    <w:p>
+      <w:pPr>
+        <w:pStyle w:val="Ttulo2"/>
+        <w:keepNext/>
+        <w:spacing w:before="200" w:after="100"/>
+      </w:pPr>
+      <w:bookmarkStart w:id="19" w:name="_Toc243856215"/>
+      <w:r>
+        <w:t>8.2. Cliente de escritorio</w:t>
+      </w:r>
+      <w:bookmarkEnd w:id="19"/>
+    </w:p>
+    <w:p>
+      <w:pPr>
+        <w:spacing w:after="120" w:line="300" w:lineRule="auto"/>
+        <w:jc w:val="both"/>
+      </w:pPr>
+      <w:r>
+        <w:t xml:space="preserve">Aplicación Swing con tema oscuro. La ventana de inicio de sesión muestra la imagen del Monster con una animación de flotación y sacude el formulario ante un error. La ventana principal ofrece botones de color por magnitud, listas de unidades, intercambio de unidades, un resultado que se anima contando hasta su valor, el historial de la sesión en una tabla y </w:t>
+      </w:r>
+      <w:r>
+        <w:lastRenderedPageBreak/>
+        <w:t>una barra de estado. Las llamadas al servidor se ejecutan en segundo plano para no bloquear la interfaz.</w:t>
+      </w:r>
+    </w:p>
+    <w:p>
+      <w:pPr>
+        <w:keepNext/>
+        <w:jc w:val="center"/>
+      </w:pPr>
+      <w:r>
+        <w:rPr>
+          <w:noProof/>
+        </w:rPr>
+        <w:drawing>
+          <wp:inline distT="0" distB="0" distL="0" distR="0" wp14:anchorId="0F5C8A7E" wp14:editId="6C39B0BA">
+            <wp:extent cx="5715000" cy="3390900"/>
+            <wp:effectExtent l="0" t="0" r="0" b="0"/>
+            <wp:docPr id="6" name="Imagen 6"/>
+            <wp:cNvGraphicFramePr>
+              <a:graphicFrameLocks xmlns:a="http://schemas.openxmlformats.org/drawingml/2006/main" noChangeAspect="1"/>
+            </wp:cNvGraphicFramePr>
+            <a:graphic xmlns:a="http://schemas.openxmlformats.org/drawingml/2006/main">
+              <a:graphicData uri="http://schemas.openxmlformats.org/drawingml/2006/picture">
+                <pic:pic xmlns:pic="http://schemas.openxmlformats.org/drawingml/2006/picture">
+                  <pic:nvPicPr>
+                    <pic:cNvPr id="0" name=""/>
+                    <pic:cNvPicPr>
+                      <a:picLocks noChangeAspect="1" noChangeArrowheads="1"/>
+                    </pic:cNvPicPr>
+                  </pic:nvPicPr>
+                  <pic:blipFill>
+                    <a:blip r:embed="rId13"/>
+                    <a:srcRect/>
+                    <a:stretch>
+                      <a:fillRect/>
+                    </a:stretch>
+                  </pic:blipFill>
+                  <pic:spPr bwMode="auto">
+                    <a:xfrm>
+                      <a:off x="0" y="0"/>
                       <a:ext cx="5715000" cy="3390900"/>
                     </a:xfrm>
                     <a:prstGeom prst="rect">
@@ -9405,6 +9376,7 @@
           <w:bCs/>
           <w:i/>
           <w:iCs/>
+          <w:noProof/>
           <w:sz w:val="20"/>
           <w:szCs w:val="20"/>
         </w:rPr>
@@ -9424,7 +9396,7 @@
                     <pic:cNvPicPr/>
                   </pic:nvPicPr>
                   <pic:blipFill>
-                    <a:blip r:embed="rId13"/>
+                    <a:blip r:embed="rId14"/>
                     <a:stretch>
                       <a:fillRect/>
                     </a:stretch>
@@ -9541,73 +9513,6 @@
             <wp:extent cx="3895725" cy="4000500"/>
             <wp:effectExtent l="0" t="0" r="0" b="0"/>
             <wp:docPr id="7" name="Imagen 7"/>
-            <wp:cNvGraphicFramePr>
-              <a:graphicFrameLocks xmlns:a="http://schemas.openxmlformats.org/drawingml/2006/main" noChangeAspect="1"/>
-            </wp:cNvGraphicFramePr>
-            <a:graphic xmlns:a="http://schemas.openxmlformats.org/drawingml/2006/main">
-              <a:graphicData uri="http://schemas.openxmlformats.org/drawingml/2006/picture">
-                <pic:pic xmlns:pic="http://schemas.openxmlformats.org/drawingml/2006/picture">
-                  <pic:nvPicPr>
-                    <pic:cNvPr id="0" name=""/>
-                    <pic:cNvPicPr>
-                      <a:picLocks noChangeAspect="1" noChangeArrowheads="1"/>
-                    </pic:cNvPicPr>
-                  </pic:nvPicPr>
-                  <pic:blipFill>
-                    <a:blip r:embed="rId14"/>
-                    <a:srcRect/>
-                    <a:stretch>
-                      <a:fillRect/>
-                    </a:stretch>
-                  </pic:blipFill>
-                  <pic:spPr bwMode="auto">
-                    <a:xfrm>
-                      <a:off x="0" y="0"/>
-                      <a:ext cx="3895725" cy="4000500"/>
-                    </a:xfrm>
-                    <a:prstGeom prst="rect">
-                      <a:avLst/>
-                    </a:prstGeom>
-                  </pic:spPr>
-                </pic:pic>
-              </a:graphicData>
-            </a:graphic>
-          </wp:inline>
-        </w:drawing>
-      </w:r>
-    </w:p>
-    <w:p>
-      <w:pPr>
-        <w:spacing w:before="120" w:after="80"/>
-        <w:jc w:val="center"/>
-      </w:pPr>
-      <w:r>
-        <w:rPr>
-          <w:b/>
-          <w:bCs/>
-          <w:i/>
-          <w:iCs/>
-          <w:sz w:val="20"/>
-          <w:szCs w:val="20"/>
-        </w:rPr>
-        <w:t>Ilustración 8. Cliente web — inicio de sesión</w:t>
-      </w:r>
-    </w:p>
-    <w:p>
-      <w:pPr>
-        <w:keepNext/>
-        <w:jc w:val="center"/>
-      </w:pPr>
-      <w:r>
-        <w:rPr>
-          <w:noProof/>
-        </w:rPr>
-        <w:lastRenderedPageBreak/>
-        <w:drawing>
-          <wp:inline distT="0" distB="0" distL="0" distR="0" wp14:anchorId="754B6E27" wp14:editId="69CDC29B">
-            <wp:extent cx="3876675" cy="4000500"/>
-            <wp:effectExtent l="0" t="0" r="0" b="0"/>
-            <wp:docPr id="8" name="Imagen 8"/>
             <wp:cNvGraphicFramePr>
               <a:graphicFrameLocks xmlns:a="http://schemas.openxmlformats.org/drawingml/2006/main" noChangeAspect="1"/>
             </wp:cNvGraphicFramePr>
@@ -9630,7 +9535,7 @@
                   <pic:spPr bwMode="auto">
                     <a:xfrm>
                       <a:off x="0" y="0"/>
-                      <a:ext cx="3876675" cy="4000500"/>
+                      <a:ext cx="3895725" cy="4000500"/>
                     </a:xfrm>
                     <a:prstGeom prst="rect">
                       <a:avLst/>
@@ -9657,36 +9562,7 @@
           <w:sz w:val="20"/>
           <w:szCs w:val="20"/>
         </w:rPr>
-        <w:t>Ilustración 9. Cliente web — conversión e historial</w:t>
-      </w:r>
-    </w:p>
-    <w:p>
-      <w:pPr>
-        <w:pStyle w:val="Ttulo2"/>
-        <w:keepNext/>
-        <w:spacing w:before="200" w:after="100"/>
-      </w:pPr>
-      <w:bookmarkStart w:id="21" w:name="_Toc243856217"/>
-      <w:r>
-        <w:t>8.4. Cliente móvil Android</w:t>
-      </w:r>
-      <w:bookmarkEnd w:id="21"/>
-    </w:p>
-    <w:p>
-      <w:pPr>
-        <w:spacing w:after="120" w:line="300" w:lineRule="auto"/>
-        <w:jc w:val="both"/>
-      </w:pPr>
-      <w:r>
-        <w:t xml:space="preserve">Aplicación nativa en Java con tres pantallas: inicio de sesión (con la URL del servidor configurable y recordada), conversión </w:t>
-      </w:r>
-      <w:proofErr w:type="spellStart"/>
-      <w:r>
-        <w:t>y</w:t>
-      </w:r>
-      <w:proofErr w:type="spellEnd"/>
-      <w:r>
-        <w:t xml:space="preserve"> historial. Las peticiones se realizan en un hilo secundario y el resultado se entrega en el hilo principal. Incluye animaciones de flotación, sacudida, conteo del resultado y aparición de las tarjetas del historial.</w:t>
+        <w:t>Ilustración 8. Cliente web — inicio de sesión</w:t>
       </w:r>
     </w:p>
     <w:p>
@@ -9700,10 +9576,10 @@
         </w:rPr>
         <w:lastRenderedPageBreak/>
         <w:drawing>
-          <wp:inline distT="0" distB="0" distL="0" distR="0" wp14:anchorId="15AF98A4" wp14:editId="0C7F8760">
-            <wp:extent cx="5715000" cy="3790950"/>
+          <wp:inline distT="0" distB="0" distL="0" distR="0" wp14:anchorId="754B6E27" wp14:editId="69CDC29B">
+            <wp:extent cx="3876675" cy="4000500"/>
             <wp:effectExtent l="0" t="0" r="0" b="0"/>
-            <wp:docPr id="9" name="Imagen 9"/>
+            <wp:docPr id="8" name="Imagen 8"/>
             <wp:cNvGraphicFramePr>
               <a:graphicFrameLocks xmlns:a="http://schemas.openxmlformats.org/drawingml/2006/main" noChangeAspect="1"/>
             </wp:cNvGraphicFramePr>
@@ -9726,6 +9602,102 @@
                   <pic:spPr bwMode="auto">
                     <a:xfrm>
                       <a:off x="0" y="0"/>
+                      <a:ext cx="3876675" cy="4000500"/>
+                    </a:xfrm>
+                    <a:prstGeom prst="rect">
+                      <a:avLst/>
+                    </a:prstGeom>
+                  </pic:spPr>
+                </pic:pic>
+              </a:graphicData>
+            </a:graphic>
+          </wp:inline>
+        </w:drawing>
+      </w:r>
+    </w:p>
+    <w:p>
+      <w:pPr>
+        <w:spacing w:before="120" w:after="80"/>
+        <w:jc w:val="center"/>
+      </w:pPr>
+      <w:r>
+        <w:rPr>
+          <w:b/>
+          <w:bCs/>
+          <w:i/>
+          <w:iCs/>
+          <w:sz w:val="20"/>
+          <w:szCs w:val="20"/>
+        </w:rPr>
+        <w:t>Ilustración 9. Cliente web — conversión e historial</w:t>
+      </w:r>
+    </w:p>
+    <w:p>
+      <w:pPr>
+        <w:pStyle w:val="Ttulo2"/>
+        <w:keepNext/>
+        <w:spacing w:before="200" w:after="100"/>
+      </w:pPr>
+      <w:bookmarkStart w:id="21" w:name="_Toc243856217"/>
+      <w:r>
+        <w:t>8.4. Cliente móvil Android</w:t>
+      </w:r>
+      <w:bookmarkEnd w:id="21"/>
+    </w:p>
+    <w:p>
+      <w:pPr>
+        <w:spacing w:after="120" w:line="300" w:lineRule="auto"/>
+        <w:jc w:val="both"/>
+      </w:pPr>
+      <w:r>
+        <w:t xml:space="preserve">Aplicación nativa en Java con tres pantallas: inicio de sesión (con la URL del servidor configurable y recordada), conversión </w:t>
+      </w:r>
+      <w:proofErr w:type="spellStart"/>
+      <w:r>
+        <w:t>y</w:t>
+      </w:r>
+      <w:proofErr w:type="spellEnd"/>
+      <w:r>
+        <w:t xml:space="preserve"> historial. Las peticiones se realizan en un hilo secundario y el resultado se entrega en el hilo principal. Incluye animaciones de flotación, sacudida, conteo del resultado y aparición de las tarjetas del historial.</w:t>
+      </w:r>
+    </w:p>
+    <w:p>
+      <w:pPr>
+        <w:keepNext/>
+        <w:jc w:val="center"/>
+      </w:pPr>
+      <w:r>
+        <w:rPr>
+          <w:noProof/>
+        </w:rPr>
+        <w:lastRenderedPageBreak/>
+        <w:drawing>
+          <wp:inline distT="0" distB="0" distL="0" distR="0" wp14:anchorId="15AF98A4" wp14:editId="0C7F8760">
+            <wp:extent cx="5715000" cy="3790950"/>
+            <wp:effectExtent l="0" t="0" r="0" b="0"/>
+            <wp:docPr id="9" name="Imagen 9"/>
+            <wp:cNvGraphicFramePr>
+              <a:graphicFrameLocks xmlns:a="http://schemas.openxmlformats.org/drawingml/2006/main" noChangeAspect="1"/>
+            </wp:cNvGraphicFramePr>
+            <a:graphic xmlns:a="http://schemas.openxmlformats.org/drawingml/2006/main">
+              <a:graphicData uri="http://schemas.openxmlformats.org/drawingml/2006/picture">
+                <pic:pic xmlns:pic="http://schemas.openxmlformats.org/drawingml/2006/picture">
+                  <pic:nvPicPr>
+                    <pic:cNvPr id="0" name=""/>
+                    <pic:cNvPicPr>
+                      <a:picLocks noChangeAspect="1" noChangeArrowheads="1"/>
+                    </pic:cNvPicPr>
+                  </pic:nvPicPr>
+                  <pic:blipFill>
+                    <a:blip r:embed="rId17"/>
+                    <a:srcRect/>
+                    <a:stretch>
+                      <a:fillRect/>
+                    </a:stretch>
+                  </pic:blipFill>
+                  <pic:spPr bwMode="auto">
+                    <a:xfrm>
+                      <a:off x="0" y="0"/>
                       <a:ext cx="5715000" cy="3790950"/>
                     </a:xfrm>
                     <a:prstGeom prst="rect">
@@ -10264,7 +10236,15 @@
         <w:jc w:val="both"/>
       </w:pPr>
       <w:r>
-        <w:t>En la app, el campo Servidor debe ser http://&lt;IP&gt;:8080/WS_CONV_UNI_RESTFUL_JAVA/api. Si la red no permite comunicación entre dispositivos, conectar el teléfono por USB y usar http://localhost:8080/WS_CONV_UNI_RESTFUL_JAVA/api después de ejecutar:</w:t>
+        <w:t xml:space="preserve">En la </w:t>
+      </w:r>
+      <w:proofErr w:type="gramStart"/>
+      <w:r>
+        <w:t>app</w:t>
+      </w:r>
+      <w:proofErr w:type="gramEnd"/>
+      <w:r>
+        <w:t>, el campo Servidor debe ser http://&lt;IP&gt;:8080/WS_CONV_UNI_RESTFUL_JAVA/api. Si la red no permite comunicación entre dispositivos, conectar el teléfono por USB y usar http://localhost:8080/WS_CONV_UNI_RESTFUL_JAVA/api después de ejecutar:</w:t>
       </w:r>
     </w:p>
     <w:p>
@@ -10368,7 +10348,15 @@
         <w:jc w:val="both"/>
       </w:pPr>
       <w:r>
-        <w:t>Rol 3 — Móvil: abrir la app en el teléfono, convertir y mostrar el historial; el panel muestra MOVIL.</w:t>
+        <w:t xml:space="preserve">Rol 3 — Móvil: abrir la </w:t>
+      </w:r>
+      <w:proofErr w:type="gramStart"/>
+      <w:r>
+        <w:t>app</w:t>
+      </w:r>
+      <w:proofErr w:type="gramEnd"/>
+      <w:r>
+        <w:t xml:space="preserve"> en el teléfono, convertir y mostrar el historial; el panel muestra MOVIL.</w:t>
       </w:r>
     </w:p>
     <w:p>
@@ -10619,8 +10607,8 @@
       </w:r>
     </w:p>
     <w:sectPr>
-      <w:headerReference w:type="default" r:id="rId17"/>
-      <w:footerReference w:type="default" r:id="rId18"/>
+      <w:headerReference w:type="default" r:id="rId18"/>
+      <w:footerReference w:type="default" r:id="rId19"/>
       <w:pgSz w:w="11906" w:h="16838"/>
       <w:pgMar w:top="1440" w:right="1440" w:bottom="1300" w:left="1440" w:header="708" w:footer="708" w:gutter="0"/>
       <w:cols w:space="720"/>

</xml_diff>

<commit_message>
Diccionario de datos (estructuras en memoria y objetos JSON) y borde en manual
</commit_message>
<xml_diff>
--- a/05. DOCUMENTACION/02. MANUAL TECNICO/MANUAL_TECNICO_CONV_UNI_RESTFUL_JAVA_SINBDD_GR01.docx
+++ b/05. DOCUMENTACION/02. MANUAL TECNICO/MANUAL_TECNICO_CONV_UNI_RESTFUL_JAVA_SINBDD_GR01.docx
@@ -10611,6 +10611,12 @@
       <w:footerReference w:type="default" r:id="rId19"/>
       <w:pgSz w:w="11906" w:h="16838"/>
       <w:pgMar w:top="1440" w:right="1440" w:bottom="1300" w:left="1440" w:header="708" w:footer="708" w:gutter="0"/>
+      <w:pgBorders>
+        <w:top w:val="single" w:sz="24" w:space="24" w:color="1F3864"/>
+        <w:left w:val="single" w:sz="48" w:space="24" w:color="1F3864"/>
+        <w:bottom w:val="single" w:sz="24" w:space="24" w:color="1F3864"/>
+        <w:right w:val="single" w:sz="24" w:space="24" w:color="1F3864"/>
+      </w:pgBorders>
       <w:cols w:space="720"/>
       <w:docGrid w:linePitch="360"/>
     </w:sectPr>

</xml_diff>